<commit_message>
Add first backlog batch of course-paper checks
</commit_message>
<xml_diff>
--- a/web/tests/fixtures/libreoffice-clean.docx
+++ b/web/tests/fixtures/libreoffice-clean.docx
@@ -145,7 +145,7 @@
       </w:pPr>
       <w:r>
         <w:rPr/>
-        <w:t>Listen, reflect, and agree on a next step. This sequence is an invented teaching example, not a finding from a real study. The team can return to listening whenever its summary is mistaken.</w:t>
+        <w:t>Listen, reflect, and agree on a next step. This sequence is an invented teaching example, not a finding from a real study. The team can return to listening whenever its summary is mistaken. An invented volunteer described the experience:</w:t>
       </w:r>
     </w:p>
     <w:p>
@@ -156,6 +156,12 @@
       <w:r>
         <w:rPr/>
         <w:t>I arrived with three suggestions and a casserole. After listening, I discovered that the request was for a ride. The casserole remained available for emergencies. This quotation and its speaker are fictional.</w:t>
+      </w:r>
+      <w:r>
+        <w:rPr>
+          <w:rStyle w:val="FootnoteReference"/>
+        </w:rPr>
+        <w:footnoteReference w:id="4"/>
       </w:r>
     </w:p>
     <w:p>
@@ -348,6 +354,28 @@
       <w:r>
         <w:rPr/>
         <w:t>Anne Aster, The Patient Ministry (Example City: Fictional Press, 2024), 24.</w:t>
+      </w:r>
+    </w:p>
+  </w:footnote>
+  <w:footnote w:id="4">
+    <w:p>
+      <w:pPr>
+        <w:pStyle w:val="FootnoteText"/>
+        <w:rPr/>
+      </w:pPr>
+      <w:r>
+        <w:rPr>
+          <w:rStyle w:val="FootnoteCharacters"/>
+        </w:rPr>
+        <w:footnoteRef/>
+      </w:r>
+      <w:r>
+        <w:rPr/>
+        <w:t xml:space="preserve"> </w:t>
+      </w:r>
+      <w:r>
+        <w:rPr/>
+        <w:t>Bennett Brew, After the Meeting (Example City: Fictional Press, 2025), 18. This source and quotation are invented.</w:t>
       </w:r>
     </w:p>
   </w:footnote>

</xml_diff>

<commit_message>
Check book and journal source citations and bibliography matches
</commit_message>
<xml_diff>
--- a/web/tests/fixtures/libreoffice-clean.docx
+++ b/web/tests/fixtures/libreoffice-clean.docx
@@ -201,7 +201,17 @@
       </w:pPr>
       <w:r>
         <w:rPr/>
-        <w:t>Aster, Anne. The Patient Ministry. Example City: Fictional Press, 2024.</w:t>
+        <w:t xml:space="preserve">Aster, Anne. </w:t>
+      </w:r>
+      <w:r>
+        <w:rPr>
+          <w:i/>
+        </w:rPr>
+        <w:t>The Patient Ministry</w:t>
+      </w:r>
+      <w:r>
+        <w:rPr/>
+        <w:t>. Example City: Fictional Press, 2024.</w:t>
       </w:r>
     </w:p>
     <w:p>
@@ -213,7 +223,17 @@
       </w:pPr>
       <w:r>
         <w:rPr/>
-        <w:t>Brew, Bennett. After the Meeting. Example City: Fictional Press, 2025.</w:t>
+        <w:t xml:space="preserve">Brew, Bennett. </w:t>
+      </w:r>
+      <w:r>
+        <w:rPr>
+          <w:i/>
+        </w:rPr>
+        <w:t>After the Meeting</w:t>
+      </w:r>
+      <w:r>
+        <w:rPr/>
+        <w:t>. Example City: Fictional Press, 2025.</w:t>
       </w:r>
     </w:p>
     <w:sectPr>
@@ -353,7 +373,17 @@
       </w:r>
       <w:r>
         <w:rPr/>
-        <w:t>Anne Aster, The Patient Ministry (Example City: Fictional Press, 2024), 24.</w:t>
+        <w:t xml:space="preserve">Anne Aster, </w:t>
+      </w:r>
+      <w:r>
+        <w:rPr>
+          <w:i/>
+        </w:rPr>
+        <w:t>The Patient Ministry</w:t>
+      </w:r>
+      <w:r>
+        <w:rPr/>
+        <w:t xml:space="preserve"> (Example City: Fictional Press, 2024), 24.</w:t>
       </w:r>
     </w:p>
   </w:footnote>
@@ -375,7 +405,17 @@
       </w:r>
       <w:r>
         <w:rPr/>
-        <w:t>Bennett Brew, After the Meeting (Example City: Fictional Press, 2025), 18. This source and quotation are invented.</w:t>
+        <w:t xml:space="preserve">Bennett Brew, </w:t>
+      </w:r>
+      <w:r>
+        <w:rPr>
+          <w:i/>
+        </w:rPr>
+        <w:t>After the Meeting</w:t>
+      </w:r>
+      <w:r>
+        <w:rPr/>
+        <w:t xml:space="preserve"> (Example City: Fictional Press, 2025), 18. This source and quotation are invented.</w:t>
       </w:r>
     </w:p>
   </w:footnote>

</xml_diff>